<commit_message>
Publish analysis reports from 21df5a7
</commit_message>
<xml_diff>
--- a/output/manuscript/TRIPOD-LLM.docx
+++ b/output/manuscript/TRIPOD-LLM.docx
@@ -188,7 +188,7 @@
                 <w:sz w:val="20"/>
                 <w:b/>
               </w:rPr>
-              <w:t xml:space="default">Applicability and notes</w:t>
+              <w:t xml:space="default">Applicability and Notes</w:t>
             </w:r>
           </w:p>
         </w:tc>
@@ -343,7 +343,7 @@
                 <w:rFonts w:ascii="Arial" w:hAnsi="Arial"/>
                 <w:sz w:val="20"/>
               </w:rPr>
-              <w:t xml:space="default">Reported at the named current section or display</w:t>
+              <w:t xml:space="default">Reported at the named section or display</w:t>
             </w:r>
           </w:p>
         </w:tc>
@@ -468,7 +468,7 @@
                 <w:rFonts w:ascii="Arial" w:hAnsi="Arial"/>
                 <w:sz w:val="20"/>
               </w:rPr>
-              <w:t xml:space="default">Manuscript abstract; Manuscript Results</w:t>
+              <w:t xml:space="default">Manuscript abstract</w:t>
             </w:r>
           </w:p>
         </w:tc>
@@ -498,7 +498,7 @@
                 <w:rFonts w:ascii="Arial" w:hAnsi="Arial"/>
                 <w:sz w:val="20"/>
               </w:rPr>
-              <w:t xml:space="default">Reported at the named current section or display</w:t>
+              <w:t xml:space="default">Reported at the named section or display</w:t>
             </w:r>
           </w:p>
         </w:tc>
@@ -653,7 +653,7 @@
                 <w:rFonts w:ascii="Arial" w:hAnsi="Arial"/>
                 <w:sz w:val="20"/>
               </w:rPr>
-              <w:t xml:space="default">Reported at the named current section or display</w:t>
+              <w:t xml:space="default">Reported at the named section or display</w:t>
             </w:r>
           </w:p>
         </w:tc>
@@ -778,7 +778,7 @@
                 <w:rFonts w:ascii="Arial" w:hAnsi="Arial"/>
                 <w:sz w:val="20"/>
               </w:rPr>
-              <w:t xml:space="default">Manuscript Background and significance; eMethods Interpretive limits</w:t>
+              <w:t xml:space="default">Manuscript Objective and Discussion</w:t>
             </w:r>
           </w:p>
         </w:tc>
@@ -808,7 +808,7 @@
                 <w:rFonts w:ascii="Arial" w:hAnsi="Arial"/>
                 <w:sz w:val="20"/>
               </w:rPr>
-              <w:t xml:space="default">Reported at the named current section or display</w:t>
+              <w:t xml:space="default">Reported at the named section or display</w:t>
             </w:r>
           </w:p>
         </w:tc>
@@ -933,7 +933,7 @@
                 <w:rFonts w:ascii="Arial" w:hAnsi="Arial"/>
                 <w:sz w:val="20"/>
               </w:rPr>
-              <w:t xml:space="default">eMethods Blinded expert assessment</w:t>
+              <w:t xml:space="default">Manuscript Objective</w:t>
             </w:r>
           </w:p>
         </w:tc>
@@ -963,7 +963,7 @@
                 <w:rFonts w:ascii="Arial" w:hAnsi="Arial"/>
                 <w:sz w:val="20"/>
               </w:rPr>
-              <w:t xml:space="default">Reported at the named current section or display</w:t>
+              <w:t xml:space="default">Reported at the named section or display</w:t>
             </w:r>
           </w:p>
         </w:tc>
@@ -1088,7 +1088,7 @@
                 <w:rFonts w:ascii="Arial" w:hAnsi="Arial"/>
                 <w:sz w:val="20"/>
               </w:rPr>
-              <w:t xml:space="default">eMethods Input parity and label targets; eTable 1</w:t>
+              <w:t xml:space="default">eMethods Benchmark and supplied inputs; Targets and input parity; eTable 1</w:t>
             </w:r>
           </w:p>
         </w:tc>
@@ -1118,7 +1118,7 @@
                 <w:rFonts w:ascii="Arial" w:hAnsi="Arial"/>
                 <w:sz w:val="20"/>
               </w:rPr>
-              <w:t xml:space="default">Reported at the named current section or display</w:t>
+              <w:t xml:space="default">Reported at the named section or display</w:t>
             </w:r>
           </w:p>
         </w:tc>
@@ -1243,7 +1243,7 @@
                 <w:rFonts w:ascii="Arial" w:hAnsi="Arial"/>
                 <w:sz w:val="20"/>
               </w:rPr>
-              <w:t xml:space="default">Supplement section 1 Benchmark trials</w:t>
+              <w:t xml:space="default">Table 1; eTables 1 and 4</w:t>
             </w:r>
           </w:p>
         </w:tc>
@@ -1273,7 +1273,7 @@
                 <w:rFonts w:ascii="Arial" w:hAnsi="Arial"/>
                 <w:sz w:val="20"/>
               </w:rPr>
-              <w:t xml:space="default">Reported at the named current section or display</w:t>
+              <w:t xml:space="default">Reported at the named section or display</w:t>
             </w:r>
           </w:p>
         </w:tc>
@@ -1398,7 +1398,7 @@
                 <w:rFonts w:ascii="Arial" w:hAnsi="Arial"/>
                 <w:sz w:val="20"/>
               </w:rPr>
-              <w:t xml:space="default">Text-date coverage is not reported; author information required</w:t>
+              <w:t xml:space="default">Text-date coverage not reported; author information required</w:t>
             </w:r>
           </w:p>
         </w:tc>
@@ -1428,7 +1428,7 @@
                 <w:rFonts w:ascii="Arial" w:hAnsi="Arial"/>
                 <w:sz w:val="20"/>
               </w:rPr>
-              <w:t xml:space="default">Partial: author information required</w:t>
+              <w:t xml:space="default">Partial; author information remains pending</w:t>
             </w:r>
           </w:p>
         </w:tc>
@@ -1463,7 +1463,7 @@
                 <w:rFonts w:ascii="Arial" w:hAnsi="Arial"/>
                 <w:sz w:val="20"/>
               </w:rPr>
-              <w:t xml:space="default">Author credentials, declarations, text-date coverage and archive details require author completion. Current section titles and stable display numbers identify reported material.</w:t>
+              <w:t xml:space="default">Author credentials, declarations, text-date coverage and archive details require author completion. Current section titles and display numbers identify reported material.</w:t>
             </w:r>
           </w:p>
         </w:tc>
@@ -1661,7 +1661,7 @@
                 <w:sz w:val="20"/>
                 <w:b/>
               </w:rPr>
-              <w:t xml:space="default">Applicability and notes</w:t>
+              <w:t xml:space="default">Applicability and Notes</w:t>
             </w:r>
           </w:p>
         </w:tc>
@@ -1786,7 +1786,7 @@
                 <w:rFonts w:ascii="Arial" w:hAnsi="Arial"/>
                 <w:sz w:val="20"/>
               </w:rPr>
-              <w:t xml:space="default">eMethods Algorithms and validation; prompt templates</w:t>
+              <w:t xml:space="default">eMethods Evidence records and source verification</w:t>
             </w:r>
           </w:p>
         </w:tc>
@@ -1816,7 +1816,7 @@
                 <w:rFonts w:ascii="Arial" w:hAnsi="Arial"/>
                 <w:sz w:val="20"/>
               </w:rPr>
-              <w:t xml:space="default">Reported at the named current section or display</w:t>
+              <w:t xml:space="default">Reported at the named section or display</w:t>
             </w:r>
           </w:p>
         </w:tc>
@@ -1941,7 +1941,7 @@
                 <w:rFonts w:ascii="Arial" w:hAnsi="Arial"/>
                 <w:sz w:val="20"/>
               </w:rPr>
-              <w:t xml:space="default">eMethods Independent reference and Overall; supplement section 5</w:t>
+              <w:t xml:space="default">eMethods Signalling mapping and eligibility; eTable 6B</w:t>
             </w:r>
           </w:p>
         </w:tc>
@@ -1971,7 +1971,7 @@
                 <w:rFonts w:ascii="Arial" w:hAnsi="Arial"/>
                 <w:sz w:val="20"/>
               </w:rPr>
-              <w:t xml:space="default">Reported at the named current section or display</w:t>
+              <w:t xml:space="default">Reported at the named section or display</w:t>
             </w:r>
           </w:p>
         </w:tc>
@@ -2096,7 +2096,7 @@
                 <w:rFonts w:ascii="Arial" w:hAnsi="Arial"/>
                 <w:sz w:val="20"/>
               </w:rPr>
-              <w:t xml:space="default">Supplement Prompt templates and run provenance; eMethods Interpretive limits</w:t>
+              <w:t xml:space="default">Prompt templates and run provenance</w:t>
             </w:r>
           </w:p>
         </w:tc>
@@ -2126,7 +2126,7 @@
                 <w:rFonts w:ascii="Arial" w:hAnsi="Arial"/>
                 <w:sz w:val="20"/>
               </w:rPr>
-              <w:t xml:space="default">Reported at the named current section or display</w:t>
+              <w:t xml:space="default">Reported at the named section or display</w:t>
             </w:r>
           </w:p>
         </w:tc>
@@ -2251,7 +2251,7 @@
                 <w:rFonts w:ascii="Arial" w:hAnsi="Arial"/>
                 <w:sz w:val="20"/>
               </w:rPr>
-              <w:t xml:space="default">N/A: fixed provider model; no model development or fine-tuning</w:t>
+              <w:t xml:space="default">Prompt templates and run provenance; complete development history requires author information</w:t>
             </w:r>
           </w:p>
         </w:tc>
@@ -2281,7 +2281,7 @@
                 <w:rFonts w:ascii="Arial" w:hAnsi="Arial"/>
                 <w:sz w:val="20"/>
               </w:rPr>
-              <w:t xml:space="default">Not applicable: fixed model and task</w:t>
+              <w:t xml:space="default">Partial; author information remains pending</w:t>
             </w:r>
           </w:p>
         </w:tc>
@@ -2406,7 +2406,7 @@
                 <w:rFonts w:ascii="Arial" w:hAnsi="Arial"/>
                 <w:sz w:val="20"/>
               </w:rPr>
-              <w:t xml:space="default">Supplement Prompt templates and run provenance</w:t>
+              <w:t xml:space="default">Prompt templates and run provenance</w:t>
             </w:r>
           </w:p>
         </w:tc>
@@ -2436,7 +2436,7 @@
                 <w:rFonts w:ascii="Arial" w:hAnsi="Arial"/>
                 <w:sz w:val="20"/>
               </w:rPr>
-              <w:t xml:space="default">Reported at the named current section or display</w:t>
+              <w:t xml:space="default">Reported at the named section or display</w:t>
             </w:r>
           </w:p>
         </w:tc>
@@ -2561,7 +2561,7 @@
                 <w:rFonts w:ascii="Arial" w:hAnsi="Arial"/>
                 <w:sz w:val="20"/>
               </w:rPr>
-              <w:t xml:space="default">eMethods Algorithms and validation; prompt templates</w:t>
+              <w:t xml:space="default">eMethods Algorithms and validation; Figures 1 and 2</w:t>
             </w:r>
           </w:p>
         </w:tc>
@@ -2591,7 +2591,7 @@
                 <w:rFonts w:ascii="Arial" w:hAnsi="Arial"/>
                 <w:sz w:val="20"/>
               </w:rPr>
-              <w:t xml:space="default">Reported at the named current section or display</w:t>
+              <w:t xml:space="default">Reported at the named section or display</w:t>
             </w:r>
           </w:p>
         </w:tc>
@@ -2716,7 +2716,7 @@
                 <w:rFonts w:ascii="Arial" w:hAnsi="Arial"/>
                 <w:sz w:val="20"/>
               </w:rPr>
-              <w:t xml:space="default">eMethods Algorithms and validation; Input parity and label targets</w:t>
+              <w:t xml:space="default">eMethods Algorithms and validation</w:t>
             </w:r>
           </w:p>
         </w:tc>
@@ -2746,7 +2746,7 @@
                 <w:rFonts w:ascii="Arial" w:hAnsi="Arial"/>
                 <w:sz w:val="20"/>
               </w:rPr>
-              <w:t xml:space="default">Reported at the named current section or display</w:t>
+              <w:t xml:space="default">Reported at the named section or display</w:t>
             </w:r>
           </w:p>
         </w:tc>
@@ -2871,7 +2871,7 @@
                 <w:rFonts w:ascii="Arial" w:hAnsi="Arial"/>
                 <w:sz w:val="20"/>
               </w:rPr>
-              <w:t xml:space="default">Table 3; eMethods Evidence binding and verification</w:t>
+              <w:t xml:space="default">Figures 4 and 5; Tables 2 and 3; eTables 2 to 6</w:t>
             </w:r>
           </w:p>
         </w:tc>
@@ -2901,7 +2901,7 @@
                 <w:rFonts w:ascii="Arial" w:hAnsi="Arial"/>
                 <w:sz w:val="20"/>
               </w:rPr>
-              <w:t xml:space="default">Reported at the named current section or display</w:t>
+              <w:t xml:space="default">Reported at the named section or display</w:t>
             </w:r>
           </w:p>
         </w:tc>
@@ -2936,7 +2936,7 @@
                 <w:rFonts w:ascii="Arial" w:hAnsi="Arial"/>
                 <w:sz w:val="20"/>
               </w:rPr>
-              <w:t xml:space="default">Author credentials, declarations, text-date coverage and archive details require author completion. Current section titles and stable display numbers identify reported material.</w:t>
+              <w:t xml:space="default">Author credentials, declarations, text-date coverage and archive details require author completion. Current section titles and display numbers identify reported material.</w:t>
             </w:r>
           </w:p>
         </w:tc>
@@ -3134,7 +3134,7 @@
                 <w:sz w:val="20"/>
                 <w:b/>
               </w:rPr>
-              <w:t xml:space="default">Applicability and notes</w:t>
+              <w:t xml:space="default">Applicability and Notes</w:t>
             </w:r>
           </w:p>
         </w:tc>
@@ -3259,7 +3259,7 @@
                 <w:rFonts w:ascii="Arial" w:hAnsi="Arial"/>
                 <w:sz w:val="20"/>
               </w:rPr>
-              <w:t xml:space="default">eMethods Blinded expert assessment; Independent reference and Overall</w:t>
+              <w:t xml:space="default">eMethods Inference and Exploratory diagnostic checks</w:t>
             </w:r>
           </w:p>
         </w:tc>
@@ -3289,7 +3289,7 @@
                 <w:rFonts w:ascii="Arial" w:hAnsi="Arial"/>
                 <w:sz w:val="20"/>
               </w:rPr>
-              <w:t xml:space="default">Reported at the named current section or display</w:t>
+              <w:t xml:space="default">Reported at the named section or display</w:t>
             </w:r>
           </w:p>
         </w:tc>
@@ -3414,7 +3414,7 @@
                 <w:rFonts w:ascii="Arial" w:hAnsi="Arial"/>
                 <w:sz w:val="20"/>
               </w:rPr>
-              <w:t xml:space="default">eMethods Input parity and label targets</w:t>
+              <w:t xml:space="default">eMethods Targets and input parity</w:t>
             </w:r>
           </w:p>
         </w:tc>
@@ -3444,7 +3444,7 @@
                 <w:rFonts w:ascii="Arial" w:hAnsi="Arial"/>
                 <w:sz w:val="20"/>
               </w:rPr>
-              <w:t xml:space="default">Reported at the named current section or display</w:t>
+              <w:t xml:space="default">Reported at the named section or display</w:t>
             </w:r>
           </w:p>
         </w:tc>
@@ -3569,7 +3569,7 @@
                 <w:rFonts w:ascii="Arial" w:hAnsi="Arial"/>
                 <w:sz w:val="20"/>
               </w:rPr>
-              <w:t xml:space="default">eMethods Blinded expert assessment; Manuscript Methods rater credentials (author completion required)</w:t>
+              <w:t xml:space="default">Manuscript Independent human reviews; eMethods Blinded human assessment; individual credentials require author information</w:t>
             </w:r>
           </w:p>
         </w:tc>
@@ -3599,7 +3599,7 @@
                 <w:rFonts w:ascii="Arial" w:hAnsi="Arial"/>
                 <w:sz w:val="20"/>
               </w:rPr>
-              <w:t xml:space="default">Partial: author information required</w:t>
+              <w:t xml:space="default">Partial; author information remains pending</w:t>
             </w:r>
           </w:p>
         </w:tc>
@@ -3724,7 +3724,7 @@
                 <w:rFonts w:ascii="Arial" w:hAnsi="Arial"/>
                 <w:sz w:val="20"/>
               </w:rPr>
-              <w:t xml:space="default">eMethods Input parity and label targets; prompt templates; Table 3</w:t>
+              <w:t xml:space="default">Manuscript Benchmark and assessment arms; Prompt templates and run provenance</w:t>
             </w:r>
           </w:p>
         </w:tc>
@@ -3754,7 +3754,7 @@
                 <w:rFonts w:ascii="Arial" w:hAnsi="Arial"/>
                 <w:sz w:val="20"/>
               </w:rPr>
-              <w:t xml:space="default">Reported at the named current section or display</w:t>
+              <w:t xml:space="default">Reported at the named section or display</w:t>
             </w:r>
           </w:p>
         </w:tc>
@@ -3879,7 +3879,7 @@
                 <w:rFonts w:ascii="Arial" w:hAnsi="Arial"/>
                 <w:sz w:val="20"/>
               </w:rPr>
-              <w:t xml:space="default">eMethods Algorithms and validation; Blinded expert assessment</w:t>
+              <w:t xml:space="default">eMethods Blinded human assessment; original blank form and multi-outcome conventions require author information</w:t>
             </w:r>
           </w:p>
         </w:tc>
@@ -3909,7 +3909,7 @@
                 <w:rFonts w:ascii="Arial" w:hAnsi="Arial"/>
                 <w:sz w:val="20"/>
               </w:rPr>
-              <w:t xml:space="default">Reported at the named current section or display</w:t>
+              <w:t xml:space="default">Partial; author information remains pending</w:t>
             </w:r>
           </w:p>
         </w:tc>
@@ -4034,7 +4034,7 @@
                 <w:rFonts w:ascii="Arial" w:hAnsi="Arial"/>
                 <w:sz w:val="20"/>
               </w:rPr>
-              <w:t xml:space="default">Figure 4; supplement sections 2 and 5</w:t>
+              <w:t xml:space="default">Figure 4; eTable 3</w:t>
             </w:r>
           </w:p>
         </w:tc>
@@ -4064,7 +4064,7 @@
                 <w:rFonts w:ascii="Arial" w:hAnsi="Arial"/>
                 <w:sz w:val="20"/>
               </w:rPr>
-              <w:t xml:space="default">Reported at the named current section or display</w:t>
+              <w:t xml:space="default">Reported at the named section or display</w:t>
             </w:r>
           </w:p>
         </w:tc>
@@ -4189,7 +4189,7 @@
                 <w:rFonts w:ascii="Arial" w:hAnsi="Arial"/>
                 <w:sz w:val="20"/>
               </w:rPr>
-              <w:t xml:space="default">Manuscript Methods rater credentials (author completion required)</w:t>
+              <w:t xml:space="default">Manuscript Independent human reviews; individual experience/calibration require author information</w:t>
             </w:r>
           </w:p>
         </w:tc>
@@ -4219,7 +4219,7 @@
                 <w:rFonts w:ascii="Arial" w:hAnsi="Arial"/>
                 <w:sz w:val="20"/>
               </w:rPr>
-              <w:t xml:space="default">Partial: author information required</w:t>
+              <w:t xml:space="default">Partial; author information remains pending</w:t>
             </w:r>
           </w:p>
         </w:tc>
@@ -4344,7 +4344,7 @@
                 <w:rFonts w:ascii="Arial" w:hAnsi="Arial"/>
                 <w:sz w:val="20"/>
               </w:rPr>
-              <w:t xml:space="default">Supplement Prompt templates and run provenance</w:t>
+              <w:t xml:space="default">Prompt templates and run provenance; prompt selection and version-freeze history require author information</w:t>
             </w:r>
           </w:p>
         </w:tc>
@@ -4374,7 +4374,7 @@
                 <w:rFonts w:ascii="Arial" w:hAnsi="Arial"/>
                 <w:sz w:val="20"/>
               </w:rPr>
-              <w:t xml:space="default">Reported at the named current section or display</w:t>
+              <w:t xml:space="default">Partial; author information remains pending</w:t>
             </w:r>
           </w:p>
         </w:tc>
@@ -4409,7 +4409,7 @@
                 <w:rFonts w:ascii="Arial" w:hAnsi="Arial"/>
                 <w:sz w:val="20"/>
               </w:rPr>
-              <w:t xml:space="default">Author credentials, declarations, text-date coverage and archive details require author completion. Current section titles and stable display numbers identify reported material.</w:t>
+              <w:t xml:space="default">Author credentials, declarations, text-date coverage and archive details require author completion. Current section titles and display numbers identify reported material.</w:t>
             </w:r>
           </w:p>
         </w:tc>
@@ -4607,7 +4607,7 @@
                 <w:sz w:val="20"/>
                 <w:b/>
               </w:rPr>
-              <w:t xml:space="default">Applicability and notes</w:t>
+              <w:t xml:space="default">Applicability and Notes</w:t>
             </w:r>
           </w:p>
         </w:tc>
@@ -4732,7 +4732,7 @@
                 <w:rFonts w:ascii="Arial" w:hAnsi="Arial"/>
                 <w:sz w:val="20"/>
               </w:rPr>
-              <w:t xml:space="default">Supplement Prompt templates and run provenance; eTable 1</w:t>
+              <w:t xml:space="default">Prompt templates and run provenance; author-attested benchmark non-use and bounded development records</w:t>
             </w:r>
           </w:p>
         </w:tc>
@@ -4762,7 +4762,7 @@
                 <w:rFonts w:ascii="Arial" w:hAnsi="Arial"/>
                 <w:sz w:val="20"/>
               </w:rPr>
-              <w:t xml:space="default">Reported at the named current section or display</w:t>
+              <w:t xml:space="default">Reported at the named section or display</w:t>
             </w:r>
           </w:p>
         </w:tc>
@@ -4887,7 +4887,7 @@
                 <w:rFonts w:ascii="Arial" w:hAnsi="Arial"/>
                 <w:sz w:val="20"/>
               </w:rPr>
-              <w:t xml:space="default">N/A: no summarisation task; source parsing described in eMethods Evidence binding and verification</w:t>
+              <w:t xml:space="default">N/A: no summarization task; source parsing in eMethods Evidence records and source verification</w:t>
             </w:r>
           </w:p>
         </w:tc>
@@ -4917,7 +4917,7 @@
                 <w:rFonts w:ascii="Arial" w:hAnsi="Arial"/>
                 <w:sz w:val="20"/>
               </w:rPr>
-              <w:t xml:space="default">Not applicable: fixed model and task</w:t>
+              <w:t xml:space="default">Not applicable to this evaluation</w:t>
             </w:r>
           </w:p>
         </w:tc>
@@ -5042,7 +5042,7 @@
                 <w:rFonts w:ascii="Arial" w:hAnsi="Arial"/>
                 <w:sz w:val="20"/>
               </w:rPr>
-              <w:t xml:space="default">N/A: no instruction tuning or alignment training was performed</w:t>
+              <w:t xml:space="default">N/A: no instruction tuning or alignment training</w:t>
             </w:r>
           </w:p>
         </w:tc>
@@ -5072,7 +5072,7 @@
                 <w:rFonts w:ascii="Arial" w:hAnsi="Arial"/>
                 <w:sz w:val="20"/>
               </w:rPr>
-              <w:t xml:space="default">Not applicable: fixed model and task</w:t>
+              <w:t xml:space="default">Not applicable to this evaluation</w:t>
             </w:r>
           </w:p>
         </w:tc>
@@ -5197,7 +5197,7 @@
                 <w:rFonts w:ascii="Arial" w:hAnsi="Arial"/>
                 <w:sz w:val="20"/>
               </w:rPr>
-              <w:t xml:space="default">Supplement Prompt templates and run provenance; eMethods API list-price reconstruction; eTables 20–22</w:t>
+              <w:t xml:space="default">Table 3; eMethods Runtime and API equivalents; linked API ledgers</w:t>
             </w:r>
           </w:p>
         </w:tc>
@@ -5227,7 +5227,7 @@
                 <w:rFonts w:ascii="Arial" w:hAnsi="Arial"/>
                 <w:sz w:val="20"/>
               </w:rPr>
-              <w:t xml:space="default">Reported at the named current section or display</w:t>
+              <w:t xml:space="default">Reported at the named section or display</w:t>
             </w:r>
           </w:p>
         </w:tc>
@@ -5352,7 +5352,7 @@
                 <w:rFonts w:ascii="Arial" w:hAnsi="Arial"/>
                 <w:sz w:val="20"/>
               </w:rPr>
-              <w:t xml:space="default">Manuscript Ethics declaration (author completion required)</w:t>
+              <w:t xml:space="default">Manuscript Ethics declaration; author confirmation required</w:t>
             </w:r>
           </w:p>
         </w:tc>
@@ -5382,7 +5382,7 @@
                 <w:rFonts w:ascii="Arial" w:hAnsi="Arial"/>
                 <w:sz w:val="20"/>
               </w:rPr>
-              <w:t xml:space="default">Partial: author information required</w:t>
+              <w:t xml:space="default">Partial; author information remains pending</w:t>
             </w:r>
           </w:p>
         </w:tc>
@@ -5507,7 +5507,7 @@
                 <w:rFonts w:ascii="Arial" w:hAnsi="Arial"/>
                 <w:sz w:val="20"/>
               </w:rPr>
-              <w:t xml:space="default">Manuscript Funding declaration (author completion required)</w:t>
+              <w:t xml:space="default">Manuscript Funding; author confirmation required</w:t>
             </w:r>
           </w:p>
         </w:tc>
@@ -5537,7 +5537,7 @@
                 <w:rFonts w:ascii="Arial" w:hAnsi="Arial"/>
                 <w:sz w:val="20"/>
               </w:rPr>
-              <w:t xml:space="default">Partial: author information required</w:t>
+              <w:t xml:space="default">Partial; author information remains pending</w:t>
             </w:r>
           </w:p>
         </w:tc>
@@ -5662,7 +5662,7 @@
                 <w:rFonts w:ascii="Arial" w:hAnsi="Arial"/>
                 <w:sz w:val="20"/>
               </w:rPr>
-              <w:t xml:space="default">Manuscript Competing interests (author completion required)</w:t>
+              <w:t xml:space="default">Manuscript Competing interests; author confirmation required</w:t>
             </w:r>
           </w:p>
         </w:tc>
@@ -5692,7 +5692,7 @@
                 <w:rFonts w:ascii="Arial" w:hAnsi="Arial"/>
                 <w:sz w:val="20"/>
               </w:rPr>
-              <w:t xml:space="default">Partial: author information required</w:t>
+              <w:t xml:space="default">Partial; author information remains pending</w:t>
             </w:r>
           </w:p>
         </w:tc>
@@ -5817,7 +5817,7 @@
                 <w:rFonts w:ascii="Arial" w:hAnsi="Arial"/>
                 <w:sz w:val="20"/>
               </w:rPr>
-              <w:t xml:space="default">Manuscript Statistical analysis; formal primary endpoint and exploratory analyses; protocol/archive identifier requires author confirmation</w:t>
+              <w:t xml:space="default">eMethods Reporting scope; archive identifier requires author confirmation</w:t>
             </w:r>
           </w:p>
         </w:tc>
@@ -5847,7 +5847,7 @@
                 <w:rFonts w:ascii="Arial" w:hAnsi="Arial"/>
                 <w:sz w:val="20"/>
               </w:rPr>
-              <w:t xml:space="default">Partial: author information required</w:t>
+              <w:t xml:space="default">Partial; author information remains pending</w:t>
             </w:r>
           </w:p>
         </w:tc>
@@ -5882,7 +5882,7 @@
                 <w:rFonts w:ascii="Arial" w:hAnsi="Arial"/>
                 <w:sz w:val="20"/>
               </w:rPr>
-              <w:t xml:space="default">Author credentials, declarations, text-date coverage and archive details require author completion. Current section titles and stable display numbers identify reported material.</w:t>
+              <w:t xml:space="default">Author credentials, declarations, text-date coverage and archive details require author completion. Current section titles and display numbers identify reported material.</w:t>
             </w:r>
           </w:p>
         </w:tc>
@@ -6080,7 +6080,7 @@
                 <w:sz w:val="20"/>
                 <w:b/>
               </w:rPr>
-              <w:t xml:space="default">Applicability and notes</w:t>
+              <w:t xml:space="default">Applicability and Notes</w:t>
             </w:r>
           </w:p>
         </w:tc>
@@ -6205,7 +6205,7 @@
                 <w:rFonts w:ascii="Arial" w:hAnsi="Arial"/>
                 <w:sz w:val="20"/>
               </w:rPr>
-              <w:t xml:space="default">Manuscript Protocol/registration statement (author confirmation required)</w:t>
+              <w:t xml:space="default">Manuscript Ethics, registration and public involvement; author confirmation required</w:t>
             </w:r>
           </w:p>
         </w:tc>
@@ -6235,7 +6235,7 @@
                 <w:rFonts w:ascii="Arial" w:hAnsi="Arial"/>
                 <w:sz w:val="20"/>
               </w:rPr>
-              <w:t xml:space="default">Partial: author information required</w:t>
+              <w:t xml:space="default">Partial; author information remains pending</w:t>
             </w:r>
           </w:p>
         </w:tc>
@@ -6360,7 +6360,7 @@
                 <w:rFonts w:ascii="Arial" w:hAnsi="Arial"/>
                 <w:sz w:val="20"/>
               </w:rPr>
-              <w:t xml:space="default">Manuscript Data availability; Results report Reproduction</w:t>
+              <w:t xml:space="default">Manuscript Data availability; Linked source records and reproducibility materials</w:t>
             </w:r>
           </w:p>
         </w:tc>
@@ -6390,7 +6390,7 @@
                 <w:rFonts w:ascii="Arial" w:hAnsi="Arial"/>
                 <w:sz w:val="20"/>
               </w:rPr>
-              <w:t xml:space="default">Reported at the named current section or display</w:t>
+              <w:t xml:space="default">Reported at the named section or display</w:t>
             </w:r>
           </w:p>
         </w:tc>
@@ -6515,7 +6515,7 @@
                 <w:rFonts w:ascii="Arial" w:hAnsi="Arial"/>
                 <w:sz w:val="20"/>
               </w:rPr>
-              <w:t xml:space="default">Results report Reproduction; Supplement Prompt templates and run provenance</w:t>
+              <w:t xml:space="default">Manuscript Data availability; Prompt templates and run provenance</w:t>
             </w:r>
           </w:p>
         </w:tc>
@@ -6545,7 +6545,7 @@
                 <w:rFonts w:ascii="Arial" w:hAnsi="Arial"/>
                 <w:sz w:val="20"/>
               </w:rPr>
-              <w:t xml:space="default">Reported at the named current section or display</w:t>
+              <w:t xml:space="default">Reported at the named section or display</w:t>
             </w:r>
           </w:p>
         </w:tc>
@@ -6670,7 +6670,7 @@
                 <w:rFonts w:ascii="Arial" w:hAnsi="Arial"/>
                 <w:sz w:val="20"/>
               </w:rPr>
-              <w:t xml:space="default">Manuscript Public involvement statement (author confirmation required)</w:t>
+              <w:t xml:space="default">Manuscript Public involvement statement; author confirmation required</w:t>
             </w:r>
           </w:p>
         </w:tc>
@@ -6700,7 +6700,7 @@
                 <w:rFonts w:ascii="Arial" w:hAnsi="Arial"/>
                 <w:sz w:val="20"/>
               </w:rPr>
-              <w:t xml:space="default">Partial: author information required</w:t>
+              <w:t xml:space="default">Partial; author information remains pending</w:t>
             </w:r>
           </w:p>
         </w:tc>
@@ -6855,7 +6855,7 @@
                 <w:rFonts w:ascii="Arial" w:hAnsi="Arial"/>
                 <w:sz w:val="20"/>
               </w:rPr>
-              <w:t xml:space="default">Reported at the named current section or display</w:t>
+              <w:t xml:space="default">Reported at the named section or display</w:t>
             </w:r>
           </w:p>
         </w:tc>
@@ -6980,7 +6980,7 @@
                 <w:rFonts w:ascii="Arial" w:hAnsi="Arial"/>
                 <w:sz w:val="20"/>
               </w:rPr>
-              <w:t xml:space="default">eTable 1</w:t>
+              <w:t xml:space="default">Table 1; eTable 1</w:t>
             </w:r>
           </w:p>
         </w:tc>
@@ -7010,7 +7010,7 @@
                 <w:rFonts w:ascii="Arial" w:hAnsi="Arial"/>
                 <w:sz w:val="20"/>
               </w:rPr>
-              <w:t xml:space="default">Reported at the named current section or display</w:t>
+              <w:t xml:space="default">Reported at the named section or display</w:t>
             </w:r>
           </w:p>
         </w:tc>
@@ -7135,7 +7135,7 @@
                 <w:rFonts w:ascii="Arial" w:hAnsi="Arial"/>
                 <w:sz w:val="20"/>
               </w:rPr>
-              <w:t xml:space="default">eTable 1; N/A for individual-patient distributions: report-level benchmark</w:t>
+              <w:t xml:space="default">Table 1; eTable 1; report-level benchmark without patient-level distributions</w:t>
             </w:r>
           </w:p>
         </w:tc>
@@ -7165,7 +7165,7 @@
                 <w:rFonts w:ascii="Arial" w:hAnsi="Arial"/>
                 <w:sz w:val="20"/>
               </w:rPr>
-              <w:t xml:space="default">Reported at the named current section or display</w:t>
+              <w:t xml:space="default">Reported at the named section or display</w:t>
             </w:r>
           </w:p>
         </w:tc>
@@ -7290,7 +7290,7 @@
                 <w:rFonts w:ascii="Arial" w:hAnsi="Arial"/>
                 <w:sz w:val="20"/>
               </w:rPr>
-              <w:t xml:space="default">Figure 3; Tables 1–3</w:t>
+              <w:t xml:space="default">Figure 3; Table 1</w:t>
             </w:r>
           </w:p>
         </w:tc>
@@ -7320,7 +7320,7 @@
                 <w:rFonts w:ascii="Arial" w:hAnsi="Arial"/>
                 <w:sz w:val="20"/>
               </w:rPr>
-              <w:t xml:space="default">Reported at the named current section or display</w:t>
+              <w:t xml:space="default">Reported at the named section or display</w:t>
             </w:r>
           </w:p>
         </w:tc>
@@ -7355,7 +7355,7 @@
                 <w:rFonts w:ascii="Arial" w:hAnsi="Arial"/>
                 <w:sz w:val="20"/>
               </w:rPr>
-              <w:t xml:space="default">Author credentials, declarations, text-date coverage and archive details require author completion. Current section titles and stable display numbers identify reported material.</w:t>
+              <w:t xml:space="default">Author credentials, declarations, text-date coverage and archive details require author completion. Current section titles and display numbers identify reported material.</w:t>
             </w:r>
           </w:p>
         </w:tc>
@@ -7553,7 +7553,7 @@
                 <w:sz w:val="20"/>
                 <w:b/>
               </w:rPr>
-              <w:t xml:space="default">Applicability and notes</w:t>
+              <w:t xml:space="default">Applicability and Notes</w:t>
             </w:r>
           </w:p>
         </w:tc>
@@ -7678,7 +7678,7 @@
                 <w:rFonts w:ascii="Arial" w:hAnsi="Arial"/>
                 <w:sz w:val="20"/>
               </w:rPr>
-              <w:t xml:space="default">Figures 4–5; Tables 1–3; eTable 2 and eTable 16; eTables 13, 13A and 13B; eFigure 2 collapsed question differences; eFigure 5 five-level and collapsed differences; eFigure 4 source-specific signalling agreement</w:t>
+              <w:t xml:space="default">Figures 4 and 5; Tables 2 and 3; eTables 2 to 6</w:t>
             </w:r>
           </w:p>
         </w:tc>
@@ -7708,7 +7708,7 @@
                 <w:rFonts w:ascii="Arial" w:hAnsi="Arial"/>
                 <w:sz w:val="20"/>
               </w:rPr>
-              <w:t xml:space="default">Reported at the named current section or display</w:t>
+              <w:t xml:space="default">Reported at the named section or display</w:t>
             </w:r>
           </w:p>
         </w:tc>
@@ -7833,7 +7833,7 @@
                 <w:rFonts w:ascii="Arial" w:hAnsi="Arial"/>
                 <w:sz w:val="20"/>
               </w:rPr>
-              <w:t xml:space="default">N/A: no model updating or adaptation was performed</w:t>
+              <w:t xml:space="default">N/A: no model updating or adaptation</w:t>
             </w:r>
           </w:p>
         </w:tc>
@@ -7863,7 +7863,7 @@
                 <w:rFonts w:ascii="Arial" w:hAnsi="Arial"/>
                 <w:sz w:val="20"/>
               </w:rPr>
-              <w:t xml:space="default">Not applicable: fixed model and task</w:t>
+              <w:t xml:space="default">Not applicable to this evaluation</w:t>
             </w:r>
           </w:p>
         </w:tc>
@@ -7988,7 +7988,7 @@
                 <w:rFonts w:ascii="Arial" w:hAnsi="Arial"/>
                 <w:sz w:val="20"/>
               </w:rPr>
-              <w:t xml:space="default">Manuscript Discussion; Manuscript Results</w:t>
+              <w:t xml:space="default">Manuscript Discussion</w:t>
             </w:r>
           </w:p>
         </w:tc>
@@ -8018,7 +8018,7 @@
                 <w:rFonts w:ascii="Arial" w:hAnsi="Arial"/>
                 <w:sz w:val="20"/>
               </w:rPr>
-              <w:t xml:space="default">Reported at the named current section or display</w:t>
+              <w:t xml:space="default">Reported at the named section or display</w:t>
             </w:r>
           </w:p>
         </w:tc>
@@ -8143,7 +8143,7 @@
                 <w:rFonts w:ascii="Arial" w:hAnsi="Arial"/>
                 <w:sz w:val="20"/>
               </w:rPr>
-              <w:t xml:space="default">eMethods Interpretive limits</w:t>
+              <w:t xml:space="default">Manuscript Discussion; eMethods Inference</w:t>
             </w:r>
           </w:p>
         </w:tc>
@@ -8173,7 +8173,7 @@
                 <w:rFonts w:ascii="Arial" w:hAnsi="Arial"/>
                 <w:sz w:val="20"/>
               </w:rPr>
-              <w:t xml:space="default">Reported at the named current section or display</w:t>
+              <w:t xml:space="default">Reported at the named section or display</w:t>
             </w:r>
           </w:p>
         </w:tc>
@@ -8298,7 +8298,7 @@
                 <w:rFonts w:ascii="Arial" w:hAnsi="Arial"/>
                 <w:sz w:val="20"/>
               </w:rPr>
-              <w:t xml:space="default">eMethods Input parity and label targets; Interpretive limits</w:t>
+              <w:t xml:space="default">eMethods Targets and input parity</w:t>
             </w:r>
           </w:p>
         </w:tc>
@@ -8328,7 +8328,7 @@
                 <w:rFonts w:ascii="Arial" w:hAnsi="Arial"/>
                 <w:sz w:val="20"/>
               </w:rPr>
-              <w:t xml:space="default">Reported at the named current section or display</w:t>
+              <w:t xml:space="default">Reported at the named section or display</w:t>
             </w:r>
           </w:p>
         </w:tc>
@@ -8453,7 +8453,7 @@
                 <w:rFonts w:ascii="Arial" w:hAnsi="Arial"/>
                 <w:sz w:val="20"/>
               </w:rPr>
-              <w:t xml:space="default">eMethods Interpretive limits; Manuscript Discussion deployment</w:t>
+              <w:t xml:space="default">Manuscript Discussion</w:t>
             </w:r>
           </w:p>
         </w:tc>
@@ -8483,7 +8483,7 @@
                 <w:rFonts w:ascii="Arial" w:hAnsi="Arial"/>
                 <w:sz w:val="20"/>
               </w:rPr>
-              <w:t xml:space="default">Reported at the named current section or display</w:t>
+              <w:t xml:space="default">Reported at the named section or display</w:t>
             </w:r>
           </w:p>
         </w:tc>
@@ -8608,7 +8608,7 @@
                 <w:rFonts w:ascii="Arial" w:hAnsi="Arial"/>
                 <w:sz w:val="20"/>
               </w:rPr>
-              <w:t xml:space="default">Table 3; eMethods Algorithms and validation; Interpretive limits</w:t>
+              <w:t xml:space="default">Table 3; eMethods Targets and input parity</w:t>
             </w:r>
           </w:p>
         </w:tc>
@@ -8638,7 +8638,7 @@
                 <w:rFonts w:ascii="Arial" w:hAnsi="Arial"/>
                 <w:sz w:val="20"/>
               </w:rPr>
-              <w:t xml:space="default">Reported at the named current section or display</w:t>
+              <w:t xml:space="default">Reported at the named section or display</w:t>
             </w:r>
           </w:p>
         </w:tc>
@@ -8763,7 +8763,7 @@
                 <w:rFonts w:ascii="Arial" w:hAnsi="Arial"/>
                 <w:sz w:val="20"/>
               </w:rPr>
-              <w:t xml:space="default">Manuscript Discussion human oversight</w:t>
+              <w:t xml:space="default">Manuscript Discussion</w:t>
             </w:r>
           </w:p>
         </w:tc>
@@ -8793,7 +8793,7 @@
                 <w:rFonts w:ascii="Arial" w:hAnsi="Arial"/>
                 <w:sz w:val="20"/>
               </w:rPr>
-              <w:t xml:space="default">Reported at the named current section or display</w:t>
+              <w:t xml:space="default">Reported at the named section or display</w:t>
             </w:r>
           </w:p>
         </w:tc>
@@ -8828,7 +8828,7 @@
                 <w:rFonts w:ascii="Arial" w:hAnsi="Arial"/>
                 <w:sz w:val="20"/>
               </w:rPr>
-              <w:t xml:space="default">Author credentials, declarations, text-date coverage and archive details require author completion. Current section titles and stable display numbers identify reported material.</w:t>
+              <w:t xml:space="default">Author credentials, declarations, text-date coverage and archive details require author completion. Current section titles and display numbers identify reported material.</w:t>
             </w:r>
           </w:p>
         </w:tc>
@@ -9026,7 +9026,7 @@
                 <w:sz w:val="20"/>
                 <w:b/>
               </w:rPr>
-              <w:t xml:space="default">Applicability and notes</w:t>
+              <w:t xml:space="default">Applicability and Notes</w:t>
             </w:r>
           </w:p>
         </w:tc>
@@ -9151,7 +9151,7 @@
                 <w:rFonts w:ascii="Arial" w:hAnsi="Arial"/>
                 <w:sz w:val="20"/>
               </w:rPr>
-              <w:t xml:space="default">Manuscript Discussion future work</w:t>
+              <w:t xml:space="default">Manuscript Discussion</w:t>
             </w:r>
           </w:p>
         </w:tc>
@@ -9181,7 +9181,7 @@
                 <w:rFonts w:ascii="Arial" w:hAnsi="Arial"/>
                 <w:sz w:val="20"/>
               </w:rPr>
-              <w:t xml:space="default">Reported at the named current section or display</w:t>
+              <w:t xml:space="default">Reported at the named section or display</w:t>
             </w:r>
           </w:p>
         </w:tc>
@@ -9336,7 +9336,7 @@
                 <w:rFonts w:ascii="Arial" w:hAnsi="Arial"/>
                 <w:sz w:val="20"/>
               </w:rPr>
-              <w:t xml:space="default">Reported at the named current section or display</w:t>
+              <w:t xml:space="default">Reported at the named section or display</w:t>
             </w:r>
           </w:p>
         </w:tc>
@@ -9491,7 +9491,7 @@
                 <w:rFonts w:ascii="Arial" w:hAnsi="Arial"/>
                 <w:sz w:val="20"/>
               </w:rPr>
-              <w:t xml:space="default">Reported at the named current section or display</w:t>
+              <w:t xml:space="default">Reported at the named section or display</w:t>
             </w:r>
           </w:p>
         </w:tc>
@@ -9616,7 +9616,7 @@
                 <w:rFonts w:ascii="Arial" w:hAnsi="Arial"/>
                 <w:sz w:val="20"/>
               </w:rPr>
-              <w:t xml:space="default">eTable 1; Figure 3</w:t>
+              <w:t xml:space="default">Table 1; eTable 1</w:t>
             </w:r>
           </w:p>
         </w:tc>
@@ -9646,7 +9646,7 @@
                 <w:rFonts w:ascii="Arial" w:hAnsi="Arial"/>
                 <w:sz w:val="20"/>
               </w:rPr>
-              <w:t xml:space="default">Reported at the named current section or display</w:t>
+              <w:t xml:space="default">Reported at the named section or display</w:t>
             </w:r>
           </w:p>
         </w:tc>
@@ -9771,7 +9771,7 @@
                 <w:rFonts w:ascii="Arial" w:hAnsi="Arial"/>
                 <w:sz w:val="20"/>
               </w:rPr>
-              <w:t xml:space="default">Manuscript Methods rater credentials (author completion required)</w:t>
+              <w:t xml:space="default">Manuscript Independent human reviews; individual credentials require author information</w:t>
             </w:r>
           </w:p>
         </w:tc>
@@ -9801,7 +9801,7 @@
                 <w:rFonts w:ascii="Arial" w:hAnsi="Arial"/>
                 <w:sz w:val="20"/>
               </w:rPr>
-              <w:t xml:space="default">Partial: author information required</w:t>
+              <w:t xml:space="default">Partial; author information remains pending</w:t>
             </w:r>
           </w:p>
         </w:tc>
@@ -9926,7 +9926,7 @@
                 <w:rFonts w:ascii="Arial" w:hAnsi="Arial"/>
                 <w:sz w:val="20"/>
               </w:rPr>
-              <w:t xml:space="default">eMethods Blinded expert assessment</w:t>
+              <w:t xml:space="default">Manuscript Objective</w:t>
             </w:r>
           </w:p>
         </w:tc>
@@ -9956,7 +9956,7 @@
                 <w:rFonts w:ascii="Arial" w:hAnsi="Arial"/>
                 <w:sz w:val="20"/>
               </w:rPr>
-              <w:t xml:space="default">Reported at the named current section or display</w:t>
+              <w:t xml:space="default">Reported at the named section or display</w:t>
             </w:r>
           </w:p>
         </w:tc>
@@ -10081,7 +10081,7 @@
                 <w:rFonts w:ascii="Arial" w:hAnsi="Arial"/>
                 <w:sz w:val="20"/>
               </w:rPr>
-              <w:t xml:space="default">Manuscript Benchmark and assessment arms; Figure 3; eTable 1 (fixed available benchmark)</w:t>
+              <w:t xml:space="default">eMethods Benchmark and supplied inputs; available purposive sample</w:t>
             </w:r>
           </w:p>
         </w:tc>
@@ -10111,7 +10111,7 @@
                 <w:rFonts w:ascii="Arial" w:hAnsi="Arial"/>
                 <w:sz w:val="20"/>
               </w:rPr>
-              <w:t xml:space="default">Reported at the named current section or display</w:t>
+              <w:t xml:space="default">Reported at the named section or display</w:t>
             </w:r>
           </w:p>
         </w:tc>
@@ -10236,7 +10236,7 @@
                 <w:rFonts w:ascii="Arial" w:hAnsi="Arial"/>
                 <w:sz w:val="20"/>
               </w:rPr>
-              <w:t xml:space="default">eTable 1; Manuscript Benchmark and assessment arms</w:t>
+              <w:t xml:space="default">eMethods Benchmark and supplied inputs; search records require author information</w:t>
             </w:r>
           </w:p>
         </w:tc>
@@ -10266,7 +10266,7 @@
                 <w:rFonts w:ascii="Arial" w:hAnsi="Arial"/>
                 <w:sz w:val="20"/>
               </w:rPr>
-              <w:t xml:space="default">Reported at the named current section or display</w:t>
+              <w:t xml:space="default">Partial; author information remains pending</w:t>
             </w:r>
           </w:p>
         </w:tc>
@@ -10301,7 +10301,7 @@
                 <w:rFonts w:ascii="Arial" w:hAnsi="Arial"/>
                 <w:sz w:val="20"/>
               </w:rPr>
-              <w:t xml:space="default">Author credentials, declarations, text-date coverage and archive details require author completion. Current section titles and stable display numbers identify reported material.</w:t>
+              <w:t xml:space="default">Author credentials, declarations, text-date coverage and archive details require author completion. Current section titles and display numbers identify reported material.</w:t>
             </w:r>
           </w:p>
         </w:tc>
@@ -10499,7 +10499,7 @@
                 <w:sz w:val="20"/>
                 <w:b/>
               </w:rPr>
-              <w:t xml:space="default">Applicability and notes</w:t>
+              <w:t xml:space="default">Applicability and Notes</w:t>
             </w:r>
           </w:p>
         </w:tc>
@@ -10624,7 +10624,7 @@
                 <w:rFonts w:ascii="Arial" w:hAnsi="Arial"/>
                 <w:sz w:val="20"/>
               </w:rPr>
-              <w:t xml:space="default">eMethods Blinded expert assessment</w:t>
+              <w:t xml:space="default">Figure 3; eMethods Blinded human assessment</w:t>
             </w:r>
           </w:p>
         </w:tc>
@@ -10654,7 +10654,7 @@
                 <w:rFonts w:ascii="Arial" w:hAnsi="Arial"/>
                 <w:sz w:val="20"/>
               </w:rPr>
-              <w:t xml:space="default">Reported at the named current section or display</w:t>
+              <w:t xml:space="default">Reported at the named section or display</w:t>
             </w:r>
           </w:p>
         </w:tc>
@@ -10779,7 +10779,7 @@
                 <w:rFonts w:ascii="Arial" w:hAnsi="Arial"/>
                 <w:sz w:val="20"/>
               </w:rPr>
-              <w:t xml:space="default">Manuscript Independent expert references; eMethods Blinded expert assessment</w:t>
+              <w:t xml:space="default">eMethods Blinded human assessment</w:t>
             </w:r>
           </w:p>
         </w:tc>
@@ -10809,7 +10809,7 @@
                 <w:rFonts w:ascii="Arial" w:hAnsi="Arial"/>
                 <w:sz w:val="20"/>
               </w:rPr>
-              <w:t xml:space="default">Reported at the named current section or display</w:t>
+              <w:t xml:space="default">Reported at the named section or display</w:t>
             </w:r>
           </w:p>
         </w:tc>
@@ -10934,7 +10934,7 @@
                 <w:rFonts w:ascii="Arial" w:hAnsi="Arial"/>
                 <w:sz w:val="20"/>
               </w:rPr>
-              <w:t xml:space="default">eMethods Independent reference and Overall</w:t>
+              <w:t xml:space="default">eMethods Inference; Exploratory diagnostic checks</w:t>
             </w:r>
           </w:p>
         </w:tc>
@@ -10964,7 +10964,7 @@
                 <w:rFonts w:ascii="Arial" w:hAnsi="Arial"/>
                 <w:sz w:val="20"/>
               </w:rPr>
-              <w:t xml:space="default">Reported at the named current section or display</w:t>
+              <w:t xml:space="default">Reported at the named section or display</w:t>
             </w:r>
           </w:p>
         </w:tc>
@@ -11119,7 +11119,7 @@
                 <w:rFonts w:ascii="Arial" w:hAnsi="Arial"/>
                 <w:sz w:val="20"/>
               </w:rPr>
-              <w:t xml:space="default">Reported at the named current section or display</w:t>
+              <w:t xml:space="default">Reported at the named section or display</w:t>
             </w:r>
           </w:p>
         </w:tc>
@@ -11244,7 +11244,7 @@
                 <w:rFonts w:ascii="Arial" w:hAnsi="Arial"/>
                 <w:sz w:val="20"/>
               </w:rPr>
-              <w:t xml:space="default">eTable 1; Manuscript Methods rater credentials (author completion required)</w:t>
+              <w:t xml:space="default">Table 1; Manuscript Independent human reviews</w:t>
             </w:r>
           </w:p>
         </w:tc>
@@ -11274,7 +11274,7 @@
                 <w:rFonts w:ascii="Arial" w:hAnsi="Arial"/>
                 <w:sz w:val="20"/>
               </w:rPr>
-              <w:t xml:space="default">Partial: author information required</w:t>
+              <w:t xml:space="default">Reported at the named section or display</w:t>
             </w:r>
           </w:p>
         </w:tc>
@@ -11399,7 +11399,7 @@
                 <w:rFonts w:ascii="Arial" w:hAnsi="Arial"/>
                 <w:sz w:val="20"/>
               </w:rPr>
-              <w:t xml:space="default">Tables 1–3; Figures 4–5</w:t>
+              <w:t xml:space="default">Figures 4 and 5; eTables 2 to 6</w:t>
             </w:r>
           </w:p>
         </w:tc>
@@ -11429,7 +11429,7 @@
                 <w:rFonts w:ascii="Arial" w:hAnsi="Arial"/>
                 <w:sz w:val="20"/>
               </w:rPr>
-              <w:t xml:space="default">Reported at the named current section or display</w:t>
+              <w:t xml:space="default">Reported at the named section or display</w:t>
             </w:r>
           </w:p>
         </w:tc>
@@ -11584,7 +11584,7 @@
                 <w:rFonts w:ascii="Arial" w:hAnsi="Arial"/>
                 <w:sz w:val="20"/>
               </w:rPr>
-              <w:t xml:space="default">Reported at the named current section or display</w:t>
+              <w:t xml:space="default">Reported at the named section or display</w:t>
             </w:r>
           </w:p>
         </w:tc>
@@ -11709,7 +11709,7 @@
                 <w:rFonts w:ascii="Arial" w:hAnsi="Arial"/>
                 <w:sz w:val="20"/>
               </w:rPr>
-              <w:t xml:space="default">Supplementary analyses; results.html; repository CSVs</w:t>
+              <w:t xml:space="default">eTables 2 to 6; Linked source records and reproducibility materials</w:t>
             </w:r>
           </w:p>
         </w:tc>
@@ -11739,7 +11739,7 @@
                 <w:rFonts w:ascii="Arial" w:hAnsi="Arial"/>
                 <w:sz w:val="20"/>
               </w:rPr>
-              <w:t xml:space="default">Reported at the named current section or display</w:t>
+              <w:t xml:space="default">Reported at the named section or display</w:t>
             </w:r>
           </w:p>
         </w:tc>
@@ -11774,7 +11774,7 @@
                 <w:rFonts w:ascii="Arial" w:hAnsi="Arial"/>
                 <w:sz w:val="20"/>
               </w:rPr>
-              <w:t xml:space="default">Author credentials, declarations, text-date coverage and archive details require author completion. Current section titles and stable display numbers identify reported material.</w:t>
+              <w:t xml:space="default">Author credentials, declarations, text-date coverage and archive details require author completion. Current section titles and display numbers identify reported material.</w:t>
             </w:r>
           </w:p>
         </w:tc>

</xml_diff>

<commit_message>
Publish analysis materials without manuscript draft
</commit_message>
<xml_diff>
--- a/output/manuscript/TRIPOD-LLM.docx
+++ b/output/manuscript/TRIPOD-LLM.docx
@@ -313,7 +313,7 @@
                 <w:rFonts w:ascii="Arial" w:hAnsi="Arial"/>
                 <w:sz w:val="20"/>
               </w:rPr>
-              <w:t xml:space="default">Manuscript title</w:t>
+              <w:t xml:space="default">Pending manuscript title</w:t>
             </w:r>
           </w:p>
         </w:tc>
@@ -343,7 +343,7 @@
                 <w:rFonts w:ascii="Arial" w:hAnsi="Arial"/>
                 <w:sz w:val="20"/>
               </w:rPr>
-              <w:t xml:space="default">Reported at the named section or display</w:t>
+              <w:t xml:space="default">Partial or pending; see retained materials and author-completion notes</w:t>
             </w:r>
           </w:p>
         </w:tc>
@@ -468,7 +468,7 @@
                 <w:rFonts w:ascii="Arial" w:hAnsi="Arial"/>
                 <w:sz w:val="20"/>
               </w:rPr>
-              <w:t xml:space="default">Manuscript abstract</w:t>
+              <w:t xml:space="default">Pending manuscript abstract</w:t>
             </w:r>
           </w:p>
         </w:tc>
@@ -498,7 +498,7 @@
                 <w:rFonts w:ascii="Arial" w:hAnsi="Arial"/>
                 <w:sz w:val="20"/>
               </w:rPr>
-              <w:t xml:space="default">Reported at the named section or display</w:t>
+              <w:t xml:space="default">Partial or pending; see retained materials and author-completion notes</w:t>
             </w:r>
           </w:p>
         </w:tc>
@@ -623,7 +623,7 @@
                 <w:rFonts w:ascii="Arial" w:hAnsi="Arial"/>
                 <w:sz w:val="20"/>
               </w:rPr>
-              <w:t xml:space="default">Manuscript Background and significance</w:t>
+              <w:t xml:space="default">Pending manuscript background</w:t>
             </w:r>
           </w:p>
         </w:tc>
@@ -653,7 +653,7 @@
                 <w:rFonts w:ascii="Arial" w:hAnsi="Arial"/>
                 <w:sz w:val="20"/>
               </w:rPr>
-              <w:t xml:space="default">Reported at the named section or display</w:t>
+              <w:t xml:space="default">Partial or pending; see retained materials and author-completion notes</w:t>
             </w:r>
           </w:p>
         </w:tc>
@@ -778,7 +778,7 @@
                 <w:rFonts w:ascii="Arial" w:hAnsi="Arial"/>
                 <w:sz w:val="20"/>
               </w:rPr>
-              <w:t xml:space="default">Manuscript Objective and Discussion</w:t>
+              <w:t xml:space="default">Pending manuscript objectives and discussion</w:t>
             </w:r>
           </w:p>
         </w:tc>
@@ -808,7 +808,7 @@
                 <w:rFonts w:ascii="Arial" w:hAnsi="Arial"/>
                 <w:sz w:val="20"/>
               </w:rPr>
-              <w:t xml:space="default">Reported at the named section or display</w:t>
+              <w:t xml:space="default">Partial or pending; see retained materials and author-completion notes</w:t>
             </w:r>
           </w:p>
         </w:tc>
@@ -933,7 +933,7 @@
                 <w:rFonts w:ascii="Arial" w:hAnsi="Arial"/>
                 <w:sz w:val="20"/>
               </w:rPr>
-              <w:t xml:space="default">Manuscript Objective</w:t>
+              <w:t xml:space="default">Pending manuscript objectives</w:t>
             </w:r>
           </w:p>
         </w:tc>
@@ -963,7 +963,7 @@
                 <w:rFonts w:ascii="Arial" w:hAnsi="Arial"/>
                 <w:sz w:val="20"/>
               </w:rPr>
-              <w:t xml:space="default">Reported at the named section or display</w:t>
+              <w:t xml:space="default">Partial or pending; see retained materials and author-completion notes</w:t>
             </w:r>
           </w:p>
         </w:tc>
@@ -1428,7 +1428,7 @@
                 <w:rFonts w:ascii="Arial" w:hAnsi="Arial"/>
                 <w:sz w:val="20"/>
               </w:rPr>
-              <w:t xml:space="default">Partial; author information remains pending</w:t>
+              <w:t xml:space="default">Partial or pending; see retained materials and author-completion notes</w:t>
             </w:r>
           </w:p>
         </w:tc>
@@ -1463,7 +1463,7 @@
                 <w:rFonts w:ascii="Arial" w:hAnsi="Arial"/>
                 <w:sz w:val="20"/>
               </w:rPr>
-              <w:t xml:space="default">Author credentials, declarations, text-date coverage and archive details require author completion. Current section titles and display numbers identify reported material.</w:t>
+              <w:t xml:space="default">The previous IMRaD draft was removed for a fresh manuscript. Pending manuscript sections, author credentials, declarations, text-date coverage and archive details require completion. Other locators identify retained analysis and supplement materials.</w:t>
             </w:r>
           </w:p>
         </w:tc>
@@ -2281,7 +2281,7 @@
                 <w:rFonts w:ascii="Arial" w:hAnsi="Arial"/>
                 <w:sz w:val="20"/>
               </w:rPr>
-              <w:t xml:space="default">Partial; author information remains pending</w:t>
+              <w:t xml:space="default">Partial or pending; see retained materials and author-completion notes</w:t>
             </w:r>
           </w:p>
         </w:tc>
@@ -2936,7 +2936,7 @@
                 <w:rFonts w:ascii="Arial" w:hAnsi="Arial"/>
                 <w:sz w:val="20"/>
               </w:rPr>
-              <w:t xml:space="default">Author credentials, declarations, text-date coverage and archive details require author completion. Current section titles and display numbers identify reported material.</w:t>
+              <w:t xml:space="default">The previous IMRaD draft was removed for a fresh manuscript. Pending manuscript sections, author credentials, declarations, text-date coverage and archive details require completion. Other locators identify retained analysis and supplement materials.</w:t>
             </w:r>
           </w:p>
         </w:tc>
@@ -3569,7 +3569,7 @@
                 <w:rFonts w:ascii="Arial" w:hAnsi="Arial"/>
                 <w:sz w:val="20"/>
               </w:rPr>
-              <w:t xml:space="default">Manuscript Independent human reviews; eMethods Blinded human assessment; individual credentials require author information</w:t>
+              <w:t xml:space="default">eMethods Blinded human assessment; individual credentials require author information</w:t>
             </w:r>
           </w:p>
         </w:tc>
@@ -3599,7 +3599,7 @@
                 <w:rFonts w:ascii="Arial" w:hAnsi="Arial"/>
                 <w:sz w:val="20"/>
               </w:rPr>
-              <w:t xml:space="default">Partial; author information remains pending</w:t>
+              <w:t xml:space="default">Partial or pending; see retained materials and author-completion notes</w:t>
             </w:r>
           </w:p>
         </w:tc>
@@ -3724,7 +3724,7 @@
                 <w:rFonts w:ascii="Arial" w:hAnsi="Arial"/>
                 <w:sz w:val="20"/>
               </w:rPr>
-              <w:t xml:space="default">Manuscript Benchmark and assessment arms; Prompt templates and run provenance</w:t>
+              <w:t xml:space="default">eMethods Benchmark and supplied inputs; Prompt templates and run provenance</w:t>
             </w:r>
           </w:p>
         </w:tc>
@@ -3909,7 +3909,7 @@
                 <w:rFonts w:ascii="Arial" w:hAnsi="Arial"/>
                 <w:sz w:val="20"/>
               </w:rPr>
-              <w:t xml:space="default">Partial; author information remains pending</w:t>
+              <w:t xml:space="default">Partial or pending; see retained materials and author-completion notes</w:t>
             </w:r>
           </w:p>
         </w:tc>
@@ -4189,7 +4189,7 @@
                 <w:rFonts w:ascii="Arial" w:hAnsi="Arial"/>
                 <w:sz w:val="20"/>
               </w:rPr>
-              <w:t xml:space="default">Manuscript Independent human reviews; individual experience/calibration require author information</w:t>
+              <w:t xml:space="default">eMethods Blinded human assessment; individual experience/calibration require author information</w:t>
             </w:r>
           </w:p>
         </w:tc>
@@ -4219,7 +4219,7 @@
                 <w:rFonts w:ascii="Arial" w:hAnsi="Arial"/>
                 <w:sz w:val="20"/>
               </w:rPr>
-              <w:t xml:space="default">Partial; author information remains pending</w:t>
+              <w:t xml:space="default">Partial or pending; see retained materials and author-completion notes</w:t>
             </w:r>
           </w:p>
         </w:tc>
@@ -4374,7 +4374,7 @@
                 <w:rFonts w:ascii="Arial" w:hAnsi="Arial"/>
                 <w:sz w:val="20"/>
               </w:rPr>
-              <w:t xml:space="default">Partial; author information remains pending</w:t>
+              <w:t xml:space="default">Partial or pending; see retained materials and author-completion notes</w:t>
             </w:r>
           </w:p>
         </w:tc>
@@ -4409,7 +4409,7 @@
                 <w:rFonts w:ascii="Arial" w:hAnsi="Arial"/>
                 <w:sz w:val="20"/>
               </w:rPr>
-              <w:t xml:space="default">Author credentials, declarations, text-date coverage and archive details require author completion. Current section titles and display numbers identify reported material.</w:t>
+              <w:t xml:space="default">The previous IMRaD draft was removed for a fresh manuscript. Pending manuscript sections, author credentials, declarations, text-date coverage and archive details require completion. Other locators identify retained analysis and supplement materials.</w:t>
             </w:r>
           </w:p>
         </w:tc>
@@ -5352,7 +5352,7 @@
                 <w:rFonts w:ascii="Arial" w:hAnsi="Arial"/>
                 <w:sz w:val="20"/>
               </w:rPr>
-              <w:t xml:space="default">Manuscript Ethics declaration; author confirmation required</w:t>
+              <w:t xml:space="default">Pending manuscript ethics declaration; author confirmation required</w:t>
             </w:r>
           </w:p>
         </w:tc>
@@ -5382,7 +5382,7 @@
                 <w:rFonts w:ascii="Arial" w:hAnsi="Arial"/>
                 <w:sz w:val="20"/>
               </w:rPr>
-              <w:t xml:space="default">Partial; author information remains pending</w:t>
+              <w:t xml:space="default">Partial or pending; see retained materials and author-completion notes</w:t>
             </w:r>
           </w:p>
         </w:tc>
@@ -5507,7 +5507,7 @@
                 <w:rFonts w:ascii="Arial" w:hAnsi="Arial"/>
                 <w:sz w:val="20"/>
               </w:rPr>
-              <w:t xml:space="default">Manuscript Funding; author confirmation required</w:t>
+              <w:t xml:space="default">Pending manuscript funding statement; author confirmation required</w:t>
             </w:r>
           </w:p>
         </w:tc>
@@ -5537,7 +5537,7 @@
                 <w:rFonts w:ascii="Arial" w:hAnsi="Arial"/>
                 <w:sz w:val="20"/>
               </w:rPr>
-              <w:t xml:space="default">Partial; author information remains pending</w:t>
+              <w:t xml:space="default">Partial or pending; see retained materials and author-completion notes</w:t>
             </w:r>
           </w:p>
         </w:tc>
@@ -5662,7 +5662,7 @@
                 <w:rFonts w:ascii="Arial" w:hAnsi="Arial"/>
                 <w:sz w:val="20"/>
               </w:rPr>
-              <w:t xml:space="default">Manuscript Competing interests; author confirmation required</w:t>
+              <w:t xml:space="default">Pending manuscript competing interests; author confirmation required</w:t>
             </w:r>
           </w:p>
         </w:tc>
@@ -5692,7 +5692,7 @@
                 <w:rFonts w:ascii="Arial" w:hAnsi="Arial"/>
                 <w:sz w:val="20"/>
               </w:rPr>
-              <w:t xml:space="default">Partial; author information remains pending</w:t>
+              <w:t xml:space="default">Partial or pending; see retained materials and author-completion notes</w:t>
             </w:r>
           </w:p>
         </w:tc>
@@ -5847,7 +5847,7 @@
                 <w:rFonts w:ascii="Arial" w:hAnsi="Arial"/>
                 <w:sz w:val="20"/>
               </w:rPr>
-              <w:t xml:space="default">Partial; author information remains pending</w:t>
+              <w:t xml:space="default">Partial or pending; see retained materials and author-completion notes</w:t>
             </w:r>
           </w:p>
         </w:tc>
@@ -5882,7 +5882,7 @@
                 <w:rFonts w:ascii="Arial" w:hAnsi="Arial"/>
                 <w:sz w:val="20"/>
               </w:rPr>
-              <w:t xml:space="default">Author credentials, declarations, text-date coverage and archive details require author completion. Current section titles and display numbers identify reported material.</w:t>
+              <w:t xml:space="default">The previous IMRaD draft was removed for a fresh manuscript. Pending manuscript sections, author credentials, declarations, text-date coverage and archive details require completion. Other locators identify retained analysis and supplement materials.</w:t>
             </w:r>
           </w:p>
         </w:tc>
@@ -6205,7 +6205,7 @@
                 <w:rFonts w:ascii="Arial" w:hAnsi="Arial"/>
                 <w:sz w:val="20"/>
               </w:rPr>
-              <w:t xml:space="default">Manuscript Ethics, registration and public involvement; author confirmation required</w:t>
+              <w:t xml:space="default">Pending manuscript registration statement; author confirmation required</w:t>
             </w:r>
           </w:p>
         </w:tc>
@@ -6235,7 +6235,7 @@
                 <w:rFonts w:ascii="Arial" w:hAnsi="Arial"/>
                 <w:sz w:val="20"/>
               </w:rPr>
-              <w:t xml:space="default">Partial; author information remains pending</w:t>
+              <w:t xml:space="default">Partial or pending; see retained materials and author-completion notes</w:t>
             </w:r>
           </w:p>
         </w:tc>
@@ -6360,7 +6360,7 @@
                 <w:rFonts w:ascii="Arial" w:hAnsi="Arial"/>
                 <w:sz w:val="20"/>
               </w:rPr>
-              <w:t xml:space="default">Manuscript Data availability; Linked source records and reproducibility materials</w:t>
+              <w:t xml:space="default">Linked source records and reproducibility materials; pending manuscript data availability statement</w:t>
             </w:r>
           </w:p>
         </w:tc>
@@ -6390,7 +6390,7 @@
                 <w:rFonts w:ascii="Arial" w:hAnsi="Arial"/>
                 <w:sz w:val="20"/>
               </w:rPr>
-              <w:t xml:space="default">Reported at the named section or display</w:t>
+              <w:t xml:space="default">Partial or pending; see retained materials and author-completion notes</w:t>
             </w:r>
           </w:p>
         </w:tc>
@@ -6515,7 +6515,7 @@
                 <w:rFonts w:ascii="Arial" w:hAnsi="Arial"/>
                 <w:sz w:val="20"/>
               </w:rPr>
-              <w:t xml:space="default">Manuscript Data availability; Prompt templates and run provenance</w:t>
+              <w:t xml:space="default">Prompt templates and run provenance; pending manuscript code availability statement</w:t>
             </w:r>
           </w:p>
         </w:tc>
@@ -6545,7 +6545,7 @@
                 <w:rFonts w:ascii="Arial" w:hAnsi="Arial"/>
                 <w:sz w:val="20"/>
               </w:rPr>
-              <w:t xml:space="default">Reported at the named section or display</w:t>
+              <w:t xml:space="default">Partial or pending; see retained materials and author-completion notes</w:t>
             </w:r>
           </w:p>
         </w:tc>
@@ -6670,7 +6670,7 @@
                 <w:rFonts w:ascii="Arial" w:hAnsi="Arial"/>
                 <w:sz w:val="20"/>
               </w:rPr>
-              <w:t xml:space="default">Manuscript Public involvement statement; author confirmation required</w:t>
+              <w:t xml:space="default">Pending manuscript public involvement statement; author confirmation required</w:t>
             </w:r>
           </w:p>
         </w:tc>
@@ -6700,7 +6700,7 @@
                 <w:rFonts w:ascii="Arial" w:hAnsi="Arial"/>
                 <w:sz w:val="20"/>
               </w:rPr>
-              <w:t xml:space="default">Partial; author information remains pending</w:t>
+              <w:t xml:space="default">Partial or pending; see retained materials and author-completion notes</w:t>
             </w:r>
           </w:p>
         </w:tc>
@@ -7355,7 +7355,7 @@
                 <w:rFonts w:ascii="Arial" w:hAnsi="Arial"/>
                 <w:sz w:val="20"/>
               </w:rPr>
-              <w:t xml:space="default">Author credentials, declarations, text-date coverage and archive details require author completion. Current section titles and display numbers identify reported material.</w:t>
+              <w:t xml:space="default">The previous IMRaD draft was removed for a fresh manuscript. Pending manuscript sections, author credentials, declarations, text-date coverage and archive details require completion. Other locators identify retained analysis and supplement materials.</w:t>
             </w:r>
           </w:p>
         </w:tc>
@@ -7988,7 +7988,7 @@
                 <w:rFonts w:ascii="Arial" w:hAnsi="Arial"/>
                 <w:sz w:val="20"/>
               </w:rPr>
-              <w:t xml:space="default">Manuscript Discussion</w:t>
+              <w:t xml:space="default">Pending manuscript discussion</w:t>
             </w:r>
           </w:p>
         </w:tc>
@@ -8018,7 +8018,7 @@
                 <w:rFonts w:ascii="Arial" w:hAnsi="Arial"/>
                 <w:sz w:val="20"/>
               </w:rPr>
-              <w:t xml:space="default">Reported at the named section or display</w:t>
+              <w:t xml:space="default">Partial or pending; see retained materials and author-completion notes</w:t>
             </w:r>
           </w:p>
         </w:tc>
@@ -8143,7 +8143,7 @@
                 <w:rFonts w:ascii="Arial" w:hAnsi="Arial"/>
                 <w:sz w:val="20"/>
               </w:rPr>
-              <w:t xml:space="default">Manuscript Discussion; eMethods Inference</w:t>
+              <w:t xml:space="default">eMethods Inference; pending manuscript limitations</w:t>
             </w:r>
           </w:p>
         </w:tc>
@@ -8173,7 +8173,7 @@
                 <w:rFonts w:ascii="Arial" w:hAnsi="Arial"/>
                 <w:sz w:val="20"/>
               </w:rPr>
-              <w:t xml:space="default">Reported at the named section or display</w:t>
+              <w:t xml:space="default">Partial or pending; see retained materials and author-completion notes</w:t>
             </w:r>
           </w:p>
         </w:tc>
@@ -8453,7 +8453,7 @@
                 <w:rFonts w:ascii="Arial" w:hAnsi="Arial"/>
                 <w:sz w:val="20"/>
               </w:rPr>
-              <w:t xml:space="default">Manuscript Discussion</w:t>
+              <w:t xml:space="default">Pending manuscript discussion</w:t>
             </w:r>
           </w:p>
         </w:tc>
@@ -8483,7 +8483,7 @@
                 <w:rFonts w:ascii="Arial" w:hAnsi="Arial"/>
                 <w:sz w:val="20"/>
               </w:rPr>
-              <w:t xml:space="default">Reported at the named section or display</w:t>
+              <w:t xml:space="default">Partial or pending; see retained materials and author-completion notes</w:t>
             </w:r>
           </w:p>
         </w:tc>
@@ -8763,7 +8763,7 @@
                 <w:rFonts w:ascii="Arial" w:hAnsi="Arial"/>
                 <w:sz w:val="20"/>
               </w:rPr>
-              <w:t xml:space="default">Manuscript Discussion</w:t>
+              <w:t xml:space="default">Pending manuscript discussion</w:t>
             </w:r>
           </w:p>
         </w:tc>
@@ -8793,7 +8793,7 @@
                 <w:rFonts w:ascii="Arial" w:hAnsi="Arial"/>
                 <w:sz w:val="20"/>
               </w:rPr>
-              <w:t xml:space="default">Reported at the named section or display</w:t>
+              <w:t xml:space="default">Partial or pending; see retained materials and author-completion notes</w:t>
             </w:r>
           </w:p>
         </w:tc>
@@ -8828,7 +8828,7 @@
                 <w:rFonts w:ascii="Arial" w:hAnsi="Arial"/>
                 <w:sz w:val="20"/>
               </w:rPr>
-              <w:t xml:space="default">Author credentials, declarations, text-date coverage and archive details require author completion. Current section titles and display numbers identify reported material.</w:t>
+              <w:t xml:space="default">The previous IMRaD draft was removed for a fresh manuscript. Pending manuscript sections, author credentials, declarations, text-date coverage and archive details require completion. Other locators identify retained analysis and supplement materials.</w:t>
             </w:r>
           </w:p>
         </w:tc>
@@ -9151,7 +9151,7 @@
                 <w:rFonts w:ascii="Arial" w:hAnsi="Arial"/>
                 <w:sz w:val="20"/>
               </w:rPr>
-              <w:t xml:space="default">Manuscript Discussion</w:t>
+              <w:t xml:space="default">Pending manuscript discussion</w:t>
             </w:r>
           </w:p>
         </w:tc>
@@ -9181,7 +9181,7 @@
                 <w:rFonts w:ascii="Arial" w:hAnsi="Arial"/>
                 <w:sz w:val="20"/>
               </w:rPr>
-              <w:t xml:space="default">Reported at the named section or display</w:t>
+              <w:t xml:space="default">Partial or pending; see retained materials and author-completion notes</w:t>
             </w:r>
           </w:p>
         </w:tc>
@@ -9306,7 +9306,7 @@
                 <w:rFonts w:ascii="Arial" w:hAnsi="Arial"/>
                 <w:sz w:val="20"/>
               </w:rPr>
-              <w:t xml:space="default">Manuscript title and abstract</w:t>
+              <w:t xml:space="default">Pending manuscript title and abstract</w:t>
             </w:r>
           </w:p>
         </w:tc>
@@ -9336,7 +9336,7 @@
                 <w:rFonts w:ascii="Arial" w:hAnsi="Arial"/>
                 <w:sz w:val="20"/>
               </w:rPr>
-              <w:t xml:space="default">Reported at the named section or display</w:t>
+              <w:t xml:space="default">Partial or pending; see retained materials and author-completion notes</w:t>
             </w:r>
           </w:p>
         </w:tc>
@@ -9771,7 +9771,7 @@
                 <w:rFonts w:ascii="Arial" w:hAnsi="Arial"/>
                 <w:sz w:val="20"/>
               </w:rPr>
-              <w:t xml:space="default">Manuscript Independent human reviews; individual credentials require author information</w:t>
+              <w:t xml:space="default">eMethods Blinded human assessment; individual credentials require author information</w:t>
             </w:r>
           </w:p>
         </w:tc>
@@ -9801,7 +9801,7 @@
                 <w:rFonts w:ascii="Arial" w:hAnsi="Arial"/>
                 <w:sz w:val="20"/>
               </w:rPr>
-              <w:t xml:space="default">Partial; author information remains pending</w:t>
+              <w:t xml:space="default">Partial or pending; see retained materials and author-completion notes</w:t>
             </w:r>
           </w:p>
         </w:tc>
@@ -9926,7 +9926,7 @@
                 <w:rFonts w:ascii="Arial" w:hAnsi="Arial"/>
                 <w:sz w:val="20"/>
               </w:rPr>
-              <w:t xml:space="default">Manuscript Objective</w:t>
+              <w:t xml:space="default">Pending manuscript objectives</w:t>
             </w:r>
           </w:p>
         </w:tc>
@@ -9956,7 +9956,7 @@
                 <w:rFonts w:ascii="Arial" w:hAnsi="Arial"/>
                 <w:sz w:val="20"/>
               </w:rPr>
-              <w:t xml:space="default">Reported at the named section or display</w:t>
+              <w:t xml:space="default">Partial or pending; see retained materials and author-completion notes</w:t>
             </w:r>
           </w:p>
         </w:tc>
@@ -10266,7 +10266,7 @@
                 <w:rFonts w:ascii="Arial" w:hAnsi="Arial"/>
                 <w:sz w:val="20"/>
               </w:rPr>
-              <w:t xml:space="default">Partial; author information remains pending</w:t>
+              <w:t xml:space="default">Partial or pending; see retained materials and author-completion notes</w:t>
             </w:r>
           </w:p>
         </w:tc>
@@ -10301,7 +10301,7 @@
                 <w:rFonts w:ascii="Arial" w:hAnsi="Arial"/>
                 <w:sz w:val="20"/>
               </w:rPr>
-              <w:t xml:space="default">Author credentials, declarations, text-date coverage and archive details require author completion. Current section titles and display numbers identify reported material.</w:t>
+              <w:t xml:space="default">The previous IMRaD draft was removed for a fresh manuscript. Pending manuscript sections, author credentials, declarations, text-date coverage and archive details require completion. Other locators identify retained analysis and supplement materials.</w:t>
             </w:r>
           </w:p>
         </w:tc>
@@ -11244,7 +11244,7 @@
                 <w:rFonts w:ascii="Arial" w:hAnsi="Arial"/>
                 <w:sz w:val="20"/>
               </w:rPr>
-              <w:t xml:space="default">Table 1; Manuscript Independent human reviews</w:t>
+              <w:t xml:space="default">Table 1; eMethods Blinded human assessment</w:t>
             </w:r>
           </w:p>
         </w:tc>
@@ -11554,7 +11554,7 @@
                 <w:rFonts w:ascii="Arial" w:hAnsi="Arial"/>
                 <w:sz w:val="20"/>
               </w:rPr>
-              <w:t xml:space="default">Manuscript Discussion</w:t>
+              <w:t xml:space="default">Pending manuscript discussion</w:t>
             </w:r>
           </w:p>
         </w:tc>
@@ -11584,7 +11584,7 @@
                 <w:rFonts w:ascii="Arial" w:hAnsi="Arial"/>
                 <w:sz w:val="20"/>
               </w:rPr>
-              <w:t xml:space="default">Reported at the named section or display</w:t>
+              <w:t xml:space="default">Partial or pending; see retained materials and author-completion notes</w:t>
             </w:r>
           </w:p>
         </w:tc>
@@ -11774,7 +11774,7 @@
                 <w:rFonts w:ascii="Arial" w:hAnsi="Arial"/>
                 <w:sz w:val="20"/>
               </w:rPr>
-              <w:t xml:space="default">Author credentials, declarations, text-date coverage and archive details require author completion. Current section titles and display numbers identify reported material.</w:t>
+              <w:t xml:space="default">The previous IMRaD draft was removed for a fresh manuscript. Pending manuscript sections, author credentials, declarations, text-date coverage and archive details require completion. Other locators identify retained analysis and supplement materials.</w:t>
             </w:r>
           </w:p>
         </w:tc>

</xml_diff>